<commit_message>
vault backup: 2026-03-26 01:58:47
</commit_message>
<xml_diff>
--- a/Savage/Operazione Sarcofago/PG-PNG/IT_Marco_Torcia_Scheda.docx
+++ b/Savage/Operazione Sarcofago/PG-PNG/IT_Marco_Torcia_Scheda.docx
@@ -788,8 +788,8 @@
         <w:gridCol w:w="1458"/>
         <w:gridCol w:w="1458"/>
         <w:gridCol w:w="1458"/>
-        <w:gridCol w:w="1458"/>
-        <w:gridCol w:w="1513"/>
+        <w:gridCol w:w="1182"/>
+        <w:gridCol w:w="1789"/>
       </w:tblGrid>
       <w:tr>
         <w:tc>
@@ -914,7 +914,7 @@
         </w:tc>
         <w:tc>
           <w:tcPr>
-            <w:tcW w:w="1458" w:type="dxa"/>
+            <w:tcW w:w="1182" w:type="dxa"/>
             <w:shd w:val="clear" w:color="auto" w:fill="2C2C2C"/>
           </w:tcPr>
           <w:p>
@@ -938,7 +938,7 @@
         </w:tc>
         <w:tc>
           <w:tcPr>
-            <w:tcW w:w="1458" w:type="dxa"/>
+            <w:tcW w:w="1789" w:type="dxa"/>
             <w:shd w:val="clear" w:color="auto" w:fill="2C2C2C"/>
           </w:tcPr>
           <w:p>
@@ -988,6 +988,7 @@
           </w:tcPr>
           <w:p>
             <w:pPr>
+              <w:jc w:val="center"/>
               <w:rPr>
                 <w:sz w:val="20"/>
                 <w:szCs w:val="24"/>
@@ -1008,6 +1009,7 @@
           </w:tcPr>
           <w:p>
             <w:pPr>
+              <w:jc w:val="center"/>
               <w:rPr>
                 <w:sz w:val="20"/>
                 <w:szCs w:val="24"/>
@@ -1028,6 +1030,7 @@
           </w:tcPr>
           <w:p>
             <w:pPr>
+              <w:jc w:val="center"/>
               <w:rPr>
                 <w:sz w:val="20"/>
                 <w:szCs w:val="24"/>
@@ -1048,6 +1051,7 @@
           </w:tcPr>
           <w:p>
             <w:pPr>
+              <w:jc w:val="center"/>
               <w:rPr>
                 <w:sz w:val="20"/>
                 <w:szCs w:val="24"/>
@@ -1064,10 +1068,11 @@
         </w:tc>
         <w:tc>
           <w:tcPr>
-            <w:tcW w:w="1458" w:type="dxa"/>
+            <w:tcW w:w="1182" w:type="dxa"/>
           </w:tcPr>
           <w:p>
             <w:pPr>
+              <w:jc w:val="center"/>
               <w:rPr>
                 <w:sz w:val="20"/>
                 <w:szCs w:val="24"/>
@@ -1084,7 +1089,7 @@
         </w:tc>
         <w:tc>
           <w:tcPr>
-            <w:tcW w:w="1458" w:type="dxa"/>
+            <w:tcW w:w="1789" w:type="dxa"/>
           </w:tcPr>
           <w:p>
             <w:pPr>
@@ -1132,6 +1137,7 @@
           </w:tcPr>
           <w:p>
             <w:pPr>
+              <w:jc w:val="center"/>
               <w:rPr>
                 <w:sz w:val="20"/>
                 <w:szCs w:val="24"/>
@@ -1153,6 +1159,7 @@
           </w:tcPr>
           <w:p>
             <w:pPr>
+              <w:jc w:val="center"/>
               <w:rPr>
                 <w:sz w:val="20"/>
                 <w:szCs w:val="24"/>
@@ -1174,6 +1181,7 @@
           </w:tcPr>
           <w:p>
             <w:pPr>
+              <w:jc w:val="center"/>
               <w:rPr>
                 <w:sz w:val="20"/>
                 <w:szCs w:val="24"/>
@@ -1195,6 +1203,7 @@
           </w:tcPr>
           <w:p>
             <w:pPr>
+              <w:jc w:val="center"/>
               <w:rPr>
                 <w:sz w:val="20"/>
                 <w:szCs w:val="24"/>
@@ -1211,11 +1220,12 @@
         </w:tc>
         <w:tc>
           <w:tcPr>
-            <w:tcW w:w="1458" w:type="dxa"/>
+            <w:tcW w:w="1182" w:type="dxa"/>
             <w:shd w:val="clear" w:color="auto" w:fill="F0F0F0"/>
           </w:tcPr>
           <w:p>
             <w:pPr>
+              <w:jc w:val="center"/>
               <w:rPr>
                 <w:sz w:val="20"/>
                 <w:szCs w:val="24"/>
@@ -1232,7 +1242,7 @@
         </w:tc>
         <w:tc>
           <w:tcPr>
-            <w:tcW w:w="1458" w:type="dxa"/>
+            <w:tcW w:w="1789" w:type="dxa"/>
             <w:shd w:val="clear" w:color="auto" w:fill="F0F0F0"/>
           </w:tcPr>
           <w:p>
@@ -1279,6 +1289,7 @@
           </w:tcPr>
           <w:p>
             <w:pPr>
+              <w:jc w:val="center"/>
               <w:rPr>
                 <w:sz w:val="20"/>
                 <w:szCs w:val="24"/>
@@ -1299,6 +1310,7 @@
           </w:tcPr>
           <w:p>
             <w:pPr>
+              <w:jc w:val="center"/>
               <w:rPr>
                 <w:sz w:val="20"/>
                 <w:szCs w:val="24"/>
@@ -1319,6 +1331,7 @@
           </w:tcPr>
           <w:p>
             <w:pPr>
+              <w:jc w:val="center"/>
               <w:rPr>
                 <w:sz w:val="20"/>
                 <w:szCs w:val="24"/>
@@ -1339,6 +1352,7 @@
           </w:tcPr>
           <w:p>
             <w:pPr>
+              <w:jc w:val="center"/>
               <w:rPr>
                 <w:sz w:val="20"/>
                 <w:szCs w:val="24"/>
@@ -1355,10 +1369,11 @@
         </w:tc>
         <w:tc>
           <w:tcPr>
-            <w:tcW w:w="1458" w:type="dxa"/>
+            <w:tcW w:w="1182" w:type="dxa"/>
           </w:tcPr>
           <w:p>
             <w:pPr>
+              <w:jc w:val="center"/>
               <w:rPr>
                 <w:sz w:val="20"/>
                 <w:szCs w:val="24"/>
@@ -1375,7 +1390,7 @@
         </w:tc>
         <w:tc>
           <w:tcPr>
-            <w:tcW w:w="1458" w:type="dxa"/>
+            <w:tcW w:w="1789" w:type="dxa"/>
           </w:tcPr>
           <w:p>
             <w:pPr>
@@ -1403,11 +1418,47 @@
           <w:szCs w:val="24"/>
         </w:rPr>
       </w:pPr>
+      <w:proofErr w:type="spellStart"/>
       <w:r>
         <w:rPr>
           <w:szCs w:val="24"/>
         </w:rPr>
-        <w:t>Armatura: Giubbotto tattico +4 torso | Elmetto +4 testa — Equip: Ottica Leupold Mk 4 | Binocolo telemetro | Taniche extra combustibile x2 | Dosimetro | Sigarette</w:t>
+        <w:t>Armatura</w:t>
+      </w:r>
+      <w:proofErr w:type="spellEnd"/>
+      <w:r>
+        <w:rPr>
+          <w:szCs w:val="24"/>
+        </w:rPr>
+        <w:t xml:space="preserve">: </w:t>
+      </w:r>
+      <w:proofErr w:type="spellStart"/>
+      <w:r>
+        <w:rPr>
+          <w:szCs w:val="24"/>
+        </w:rPr>
+        <w:t>Giubbotto</w:t>
+      </w:r>
+      <w:proofErr w:type="spellEnd"/>
+      <w:r>
+        <w:rPr>
+          <w:szCs w:val="24"/>
+        </w:rPr>
+        <w:t xml:space="preserve"> </w:t>
+      </w:r>
+      <w:proofErr w:type="spellStart"/>
+      <w:r>
+        <w:rPr>
+          <w:szCs w:val="24"/>
+        </w:rPr>
+        <w:t>tattico</w:t>
+      </w:r>
+      <w:proofErr w:type="spellEnd"/>
+      <w:r>
+        <w:rPr>
+          <w:szCs w:val="24"/>
+        </w:rPr>
+        <w:t xml:space="preserve"> +4 torso | Elmetto +4 testa — Equip: Ottica Leupold Mk 4 | Binocolo telemetro | Taniche extra combustibile x2 | Dosimetro | Sigarette</w:t>
       </w:r>
     </w:p>
     <w:p>
@@ -2234,7 +2285,39 @@
           <w:b/>
           <w:sz w:val="22"/>
         </w:rPr>
-        <w:t xml:space="preserve">Devi reagire a quello che leggi SENZA </w:t>
+        <w:t xml:space="preserve">Devi reagire a quello </w:t>
+      </w:r>
+      <w:proofErr w:type="spellStart"/>
+      <w:r>
+        <w:rPr>
+          <w:b/>
+          <w:sz w:val="22"/>
+        </w:rPr>
+        <w:t>che</w:t>
+      </w:r>
+      <w:proofErr w:type="spellEnd"/>
+      <w:r>
+        <w:rPr>
+          <w:b/>
+          <w:sz w:val="22"/>
+        </w:rPr>
+        <w:t xml:space="preserve"> </w:t>
+      </w:r>
+      <w:proofErr w:type="spellStart"/>
+      <w:r>
+        <w:rPr>
+          <w:b/>
+          <w:sz w:val="22"/>
+        </w:rPr>
+        <w:t>leggi</w:t>
+      </w:r>
+      <w:proofErr w:type="spellEnd"/>
+      <w:r>
+        <w:rPr>
+          <w:b/>
+          <w:sz w:val="22"/>
+        </w:rPr>
+        <w:t xml:space="preserve"> SENZA </w:t>
       </w:r>
       <w:proofErr w:type="spellStart"/>
       <w:r>
@@ -2422,26 +2505,56 @@
     </w:p>
     <w:p>
       <w:pPr>
-        <w:spacing w:after="80"/>
+        <w:spacing w:after="200"/>
+        <w:rPr>
+          <w:b/>
+          <w:sz w:val="20"/>
+        </w:rPr>
       </w:pPr>
       <w:r>
         <w:rPr>
+          <w:b/>
           <w:sz w:val="20"/>
         </w:rPr>
-        <w:t>Se il GM ti dice di fare qualcosa nel fogliettino, FALLO. E' l'IA che ti controlla.</w:t>
+        <w:t xml:space="preserve">Se </w:t>
+      </w:r>
+      <w:proofErr w:type="spellStart"/>
+      <w:r>
+        <w:rPr>
+          <w:b/>
+          <w:sz w:val="20"/>
+        </w:rPr>
+        <w:t>ti</w:t>
+      </w:r>
+      <w:proofErr w:type="spellEnd"/>
+      <w:r>
+        <w:rPr>
+          <w:b/>
+          <w:sz w:val="20"/>
+        </w:rPr>
+        <w:t xml:space="preserve"> </w:t>
+      </w:r>
+      <w:proofErr w:type="spellStart"/>
+      <w:r>
+        <w:rPr>
+          <w:b/>
+          <w:sz w:val="20"/>
+        </w:rPr>
+        <w:t>chiedono</w:t>
+      </w:r>
+      <w:proofErr w:type="spellEnd"/>
+      <w:r>
+        <w:rPr>
+          <w:b/>
+          <w:sz w:val="20"/>
+        </w:rPr>
+        <w:t xml:space="preserve"> se stai bene: menti. Sempre.</w:t>
       </w:r>
     </w:p>
     <w:p>
       <w:pPr>
         <w:spacing w:after="200"/>
       </w:pPr>
-      <w:r>
-        <w:rPr>
-          <w:b/>
-          <w:sz w:val="20"/>
-        </w:rPr>
-        <w:t>Se ti chiedono se stai bene: menti. Sempre.</w:t>
-      </w:r>
     </w:p>
     <w:p>
       <w:pPr>

</xml_diff>

<commit_message>
vault backup: 2026-03-26 19:23:33
</commit_message>
<xml_diff>
--- a/Savage/Operazione Sarcofago/PG-PNG/IT_Marco_Torcia_Scheda.docx
+++ b/Savage/Operazione Sarcofago/PG-PNG/IT_Marco_Torcia_Scheda.docx
@@ -2285,7 +2285,39 @@
           <w:b/>
           <w:sz w:val="22"/>
         </w:rPr>
-        <w:t xml:space="preserve">Devi reagire a quello </w:t>
+        <w:t xml:space="preserve">Devi </w:t>
+      </w:r>
+      <w:proofErr w:type="spellStart"/>
+      <w:r>
+        <w:rPr>
+          <w:b/>
+          <w:sz w:val="22"/>
+        </w:rPr>
+        <w:t>reagire</w:t>
+      </w:r>
+      <w:proofErr w:type="spellEnd"/>
+      <w:r>
+        <w:rPr>
+          <w:b/>
+          <w:sz w:val="22"/>
+        </w:rPr>
+        <w:t xml:space="preserve"> a </w:t>
+      </w:r>
+      <w:proofErr w:type="spellStart"/>
+      <w:r>
+        <w:rPr>
+          <w:b/>
+          <w:sz w:val="22"/>
+        </w:rPr>
+        <w:t>quello</w:t>
+      </w:r>
+      <w:proofErr w:type="spellEnd"/>
+      <w:r>
+        <w:rPr>
+          <w:b/>
+          <w:sz w:val="22"/>
+        </w:rPr>
+        <w:t xml:space="preserve"> </w:t>
       </w:r>
       <w:proofErr w:type="spellStart"/>
       <w:r>
@@ -2548,7 +2580,23 @@
           <w:b/>
           <w:sz w:val="20"/>
         </w:rPr>
-        <w:t xml:space="preserve"> se stai bene: menti. Sempre.</w:t>
+        <w:t xml:space="preserve"> se </w:t>
+      </w:r>
+      <w:proofErr w:type="spellStart"/>
+      <w:r>
+        <w:rPr>
+          <w:b/>
+          <w:sz w:val="20"/>
+        </w:rPr>
+        <w:t>stai</w:t>
+      </w:r>
+      <w:proofErr w:type="spellEnd"/>
+      <w:r>
+        <w:rPr>
+          <w:b/>
+          <w:sz w:val="20"/>
+        </w:rPr>
+        <w:t xml:space="preserve"> bene: menti. Sempre.</w:t>
       </w:r>
     </w:p>
     <w:p>

</xml_diff>